<commit_message>
feat: asociar etiquetas de formulario y guardar el trabajo local
Publica la correccion de confiabilidad y los cambios que quedaron fuera del ultimo pull, sin los scripts que solo generan datasets.

Co-authored-by: Cursor <cursoragent@cursor.com>
</commit_message>
<xml_diff>
--- a/documents/Intervencion metodologica y plan de tesis/Anexo7_Intervencion_Metodologica_Prompt_Centered_SDLC.docx
+++ b/documents/Intervencion metodologica y plan de tesis/Anexo7_Intervencion_Metodologica_Prompt_Centered_SDLC.docx
@@ -817,7 +817,7 @@
                 <w:color w:val="1A1A1A"/>
                 <w:sz w:val="18"/>
               </w:rPr>
-              <w:t>29 registros vigentes</w:t>
+              <w:t>48 registros vigentes</w:t>
             </w:r>
           </w:p>
         </w:tc>
@@ -1077,7 +1077,7 @@
                 <w:color w:val="1A1A1A"/>
                 <w:sz w:val="18"/>
               </w:rPr>
-              <w:t>I-001 … I-009; 0.1.0–0.9.1</w:t>
+              <w:t>I-001 … I-017; 0.1.0–0.10.7</w:t>
             </w:r>
           </w:p>
         </w:tc>
@@ -4345,7 +4345,7 @@
                 <w:color w:val="1A1A1A"/>
                 <w:sz w:val="16"/>
               </w:rPr>
-              <w:t>R-001 … R-005</w:t>
+              <w:t>R-001 … R-006</w:t>
             </w:r>
           </w:p>
         </w:tc>
@@ -4475,7 +4475,7 @@
                 <w:color w:val="1A1A1A"/>
                 <w:sz w:val="16"/>
               </w:rPr>
-              <w:t>D-001 … D-006</w:t>
+              <w:t>D-001 … D-007</w:t>
             </w:r>
           </w:p>
         </w:tc>
@@ -4605,7 +4605,7 @@
                 <w:color w:val="1A1A1A"/>
                 <w:sz w:val="16"/>
               </w:rPr>
-              <w:t>I-001 … I-009</w:t>
+              <w:t>I-001 … I-017</w:t>
             </w:r>
           </w:p>
         </w:tc>
@@ -4735,7 +4735,7 @@
                 <w:color w:val="1A1A1A"/>
                 <w:sz w:val="16"/>
               </w:rPr>
-              <w:t>T-001 … T-005</w:t>
+              <w:t>T-001 … T-014</w:t>
             </w:r>
           </w:p>
         </w:tc>
@@ -7344,144 +7344,49 @@
             <w:r>
               <w:rPr>
                 <w:rFonts w:ascii="Times New Roman" w:eastAsia="Times New Roman" w:hAnsi="Times New Roman" w:cs="Times New Roman"/>
+                <w:b w:val="0"/>
+                <w:bCs/>
+                <w:i w:val="0"/>
+                <w:iCs/>
+                <w:color w:val="1A5F7A"/>
+                <w:sz w:val="22"/>
+              </w:rPr>
+              <w:t>Los diagramas comparan la gestión actual con el flujo de Sigemad. Las figuras 4 y 5 corresponden al mantenimiento de equipos; las figuras 6 y 7, a la ficha técnica.</w:t>
+            </w:r>
+            <w:r>
+              <w:rPr>
+                <w:rFonts w:ascii="Times New Roman" w:eastAsia="Times New Roman" w:hAnsi="Times New Roman" w:cs="Times New Roman"/>
                 <w:bCs/>
                 <w:iCs/>
                 <w:color w:val="1A1A1A"/>
                 <w:sz w:val="20"/>
               </w:rPr>
-              <w:t xml:space="preserve">Pendiente. Los apartados 3.4 y 3.5 (macroprocesos y Bizagi) se rellenan en una pasada posterior. No se </w:t>
-            </w:r>
-            <w:r>
-              <w:rPr>
-                <w:rFonts w:ascii="Times New Roman" w:eastAsia="Times New Roman" w:hAnsi="Times New Roman" w:cs="Times New Roman"/>
-                <w:bCs/>
-                <w:iCs/>
-                <w:color w:val="1A1A1A"/>
-                <w:sz w:val="20"/>
-              </w:rPr>
-              <w:lastRenderedPageBreak/>
-              <w:t>modifican las figuras as-is ya pegadas.</w:t>
             </w:r>
           </w:p>
         </w:tc>
       </w:tr>
     </w:tbl>
-    <w:p/>
-    <w:p>
-      <w:proofErr w:type="spellStart"/>
-      <w:r>
-        <w:t>Estos</w:t>
-      </w:r>
-      <w:proofErr w:type="spellEnd"/>
-      <w:r>
-        <w:t xml:space="preserve"> son el As IS – </w:t>
-      </w:r>
-      <w:proofErr w:type="spellStart"/>
-      <w:r>
-        <w:t>luego</w:t>
-      </w:r>
-      <w:proofErr w:type="spellEnd"/>
-      <w:r>
-        <w:t xml:space="preserve"> hare el to be </w:t>
-      </w:r>
-      <w:proofErr w:type="spellStart"/>
-      <w:r>
-        <w:t>asi</w:t>
-      </w:r>
-      <w:proofErr w:type="spellEnd"/>
-      <w:r>
-        <w:t xml:space="preserve"> que de </w:t>
-      </w:r>
-      <w:proofErr w:type="spellStart"/>
-      <w:r>
-        <w:t>momento</w:t>
-      </w:r>
-      <w:proofErr w:type="spellEnd"/>
-      <w:r>
-        <w:t xml:space="preserve"> </w:t>
-      </w:r>
-      <w:proofErr w:type="spellStart"/>
-      <w:r>
-        <w:t>dejalo</w:t>
-      </w:r>
-      <w:proofErr w:type="spellEnd"/>
-      <w:r>
-        <w:t xml:space="preserve"> </w:t>
-      </w:r>
-      <w:proofErr w:type="spellStart"/>
-      <w:r>
-        <w:t>como</w:t>
-      </w:r>
-      <w:proofErr w:type="spellEnd"/>
-      <w:r>
-        <w:t xml:space="preserve"> </w:t>
-      </w:r>
-      <w:proofErr w:type="spellStart"/>
-      <w:r>
-        <w:t>esta</w:t>
-      </w:r>
-      <w:proofErr w:type="spellEnd"/>
-    </w:p>
     <w:p>
       <w:pPr>
-        <w:rPr>
-          <w:b/>
-          <w:bCs/>
-          <w:color w:val="FF0000"/>
-          <w:lang w:val="es-ES"/>
-        </w:rPr>
+        <w:jc w:val="center"/>
       </w:pPr>
       <w:r>
-        <w:t xml:space="preserve">M.01 — </w:t>
-      </w:r>
-      <w:proofErr w:type="spellStart"/>
-      <w:r>
-        <w:t>Gestión</w:t>
-      </w:r>
-      <w:proofErr w:type="spellEnd"/>
-      <w:r>
-        <w:t xml:space="preserve"> de </w:t>
-      </w:r>
-      <w:proofErr w:type="spellStart"/>
-      <w:r>
-        <w:t>Requerimientos</w:t>
-      </w:r>
-      <w:proofErr w:type="spellEnd"/>
-      <w:r>
-        <w:t xml:space="preserve"> y </w:t>
-      </w:r>
-      <w:proofErr w:type="spellStart"/>
-      <w:r>
-        <w:t>Servicios</w:t>
-      </w:r>
-      <w:proofErr w:type="spellEnd"/>
-      <w:r>
-        <w:t xml:space="preserve"> TI</w:t>
-      </w:r>
-    </w:p>
-    <w:p>
-      <w:r>
-        <w:rPr>
-          <w:noProof/>
-          <w:lang w:val="es-ES"/>
-        </w:rPr>
         <w:drawing>
-          <wp:inline distT="0" distB="0" distL="0" distR="0" wp14:anchorId="337E774A" wp14:editId="15B31E16">
-            <wp:extent cx="5400040" cy="2112645"/>
-            <wp:effectExtent l="0" t="0" r="0" b="1905"/>
-            <wp:docPr id="14" name="Imagen 14"/>
+          <wp:inline xmlns:a="http://schemas.openxmlformats.org/drawingml/2006/main" xmlns:pic="http://schemas.openxmlformats.org/drawingml/2006/picture">
+            <wp:extent cx="5580000" cy="3555692"/>
+            <wp:docPr id="100022" name="Picture 100022"/>
             <wp:cNvGraphicFramePr>
-              <a:graphicFrameLocks xmlns:a="http://schemas.openxmlformats.org/drawingml/2006/main" noChangeAspect="1"/>
+              <a:graphicFrameLocks noChangeAspect="1"/>
             </wp:cNvGraphicFramePr>
-            <a:graphic xmlns:a="http://schemas.openxmlformats.org/drawingml/2006/main">
+            <a:graphic>
               <a:graphicData uri="http://schemas.openxmlformats.org/drawingml/2006/picture">
-                <pic:pic xmlns:pic="http://schemas.openxmlformats.org/drawingml/2006/picture">
+                <pic:pic>
                   <pic:nvPicPr>
-                    <pic:cNvPr id="1" name=""/>
+                    <pic:cNvPr id="0" name="fig_a7_4_bizagi_asis.png"/>
                     <pic:cNvPicPr/>
                   </pic:nvPicPr>
                   <pic:blipFill>
-                    <a:blip r:embed="rId12"/>
+                    <a:blip r:embed="rId42"/>
                     <a:stretch>
                       <a:fillRect/>
                     </a:stretch>
@@ -7489,11 +7394,9 @@
                   <pic:spPr>
                     <a:xfrm>
                       <a:off x="0" y="0"/>
-                      <a:ext cx="5400040" cy="2112645"/>
+                      <a:ext cx="5580000" cy="3555692"/>
                     </a:xfrm>
-                    <a:prstGeom prst="rect">
-                      <a:avLst/>
-                    </a:prstGeom>
+                    <a:prstGeom prst="rect"/>
                   </pic:spPr>
                 </pic:pic>
               </a:graphicData>
@@ -7503,210 +7406,42 @@
       </w:r>
     </w:p>
     <w:p>
-      <w:proofErr w:type="spellStart"/>
-      <w:r>
-        <w:rPr>
-          <w:rFonts w:ascii="Times New Roman" w:eastAsia="Times New Roman" w:hAnsi="Times New Roman" w:cs="Times New Roman"/>
+      <w:pPr>
+        <w:jc w:val="center"/>
+      </w:pPr>
+      <w:r>
+        <w:rPr>
+          <w:rFonts w:ascii="Times New Roman" w:hAnsi="Times New Roman" w:eastAsia="Times New Roman"/>
+          <w:b w:val="0"/>
           <w:i/>
-          <w:iCs/>
           <w:color w:val="4A5568"/>
           <w:sz w:val="20"/>
         </w:rPr>
-        <w:t>Figura</w:t>
-      </w:r>
-      <w:proofErr w:type="spellEnd"/>
-      <w:r>
-        <w:rPr>
-          <w:rFonts w:ascii="Times New Roman" w:eastAsia="Times New Roman" w:hAnsi="Times New Roman" w:cs="Times New Roman"/>
-          <w:i/>
-          <w:iCs/>
-          <w:color w:val="4A5568"/>
-          <w:sz w:val="20"/>
-        </w:rPr>
-        <w:t xml:space="preserve"> 4. </w:t>
-      </w:r>
-      <w:proofErr w:type="spellStart"/>
-      <w:r>
-        <w:rPr>
-          <w:rFonts w:ascii="Times New Roman" w:eastAsia="Times New Roman" w:hAnsi="Times New Roman" w:cs="Times New Roman"/>
-          <w:i/>
-          <w:iCs/>
-          <w:color w:val="4A5568"/>
-          <w:sz w:val="20"/>
-        </w:rPr>
-        <w:t>Diagrama</w:t>
-      </w:r>
-      <w:proofErr w:type="spellEnd"/>
-      <w:r>
-        <w:rPr>
-          <w:rFonts w:ascii="Times New Roman" w:eastAsia="Times New Roman" w:hAnsi="Times New Roman" w:cs="Times New Roman"/>
-          <w:i/>
-          <w:iCs/>
-          <w:color w:val="4A5568"/>
-          <w:sz w:val="20"/>
-        </w:rPr>
-        <w:t xml:space="preserve"> de </w:t>
-      </w:r>
-      <w:proofErr w:type="spellStart"/>
-      <w:r>
-        <w:rPr>
-          <w:rFonts w:ascii="Times New Roman" w:eastAsia="Times New Roman" w:hAnsi="Times New Roman" w:cs="Times New Roman"/>
-          <w:i/>
-          <w:iCs/>
-          <w:color w:val="4A5568"/>
-          <w:sz w:val="20"/>
-        </w:rPr>
-        <w:t>proceso</w:t>
-      </w:r>
-      <w:proofErr w:type="spellEnd"/>
-      <w:r>
-        <w:rPr>
-          <w:rFonts w:ascii="Times New Roman" w:eastAsia="Times New Roman" w:hAnsi="Times New Roman" w:cs="Times New Roman"/>
-          <w:i/>
-          <w:iCs/>
-          <w:color w:val="4A5568"/>
-          <w:sz w:val="20"/>
-        </w:rPr>
-        <w:t xml:space="preserve"> as-is. Fuente: </w:t>
-      </w:r>
-      <w:proofErr w:type="spellStart"/>
-      <w:r>
-        <w:rPr>
-          <w:rFonts w:ascii="Times New Roman" w:eastAsia="Times New Roman" w:hAnsi="Times New Roman" w:cs="Times New Roman"/>
-          <w:i/>
-          <w:iCs/>
-          <w:color w:val="4A5568"/>
-          <w:sz w:val="20"/>
-        </w:rPr>
-        <w:t>elaboración</w:t>
-      </w:r>
-      <w:proofErr w:type="spellEnd"/>
-      <w:r>
-        <w:rPr>
-          <w:rFonts w:ascii="Times New Roman" w:eastAsia="Times New Roman" w:hAnsi="Times New Roman" w:cs="Times New Roman"/>
-          <w:i/>
-          <w:iCs/>
-          <w:color w:val="4A5568"/>
-          <w:sz w:val="20"/>
-        </w:rPr>
-        <w:t xml:space="preserve"> </w:t>
-      </w:r>
-      <w:proofErr w:type="spellStart"/>
-      <w:r>
-        <w:rPr>
-          <w:rFonts w:ascii="Times New Roman" w:eastAsia="Times New Roman" w:hAnsi="Times New Roman" w:cs="Times New Roman"/>
-          <w:i/>
-          <w:iCs/>
-          <w:color w:val="4A5568"/>
-          <w:sz w:val="20"/>
-        </w:rPr>
-        <w:t>propia</w:t>
-      </w:r>
-      <w:proofErr w:type="spellEnd"/>
-      <w:r>
-        <w:rPr>
-          <w:rFonts w:ascii="Times New Roman" w:eastAsia="Times New Roman" w:hAnsi="Times New Roman" w:cs="Times New Roman"/>
-          <w:i/>
-          <w:iCs/>
-          <w:color w:val="4A5568"/>
-          <w:sz w:val="20"/>
-        </w:rPr>
-        <w:t xml:space="preserve"> </w:t>
-      </w:r>
-      <w:proofErr w:type="spellStart"/>
-      <w:r>
-        <w:rPr>
-          <w:rFonts w:ascii="Times New Roman" w:eastAsia="Times New Roman" w:hAnsi="Times New Roman" w:cs="Times New Roman"/>
-          <w:i/>
-          <w:iCs/>
-          <w:color w:val="4A5568"/>
-          <w:sz w:val="20"/>
-        </w:rPr>
-        <w:t>en</w:t>
-      </w:r>
-      <w:proofErr w:type="spellEnd"/>
-      <w:r>
-        <w:rPr>
-          <w:rFonts w:ascii="Times New Roman" w:eastAsia="Times New Roman" w:hAnsi="Times New Roman" w:cs="Times New Roman"/>
-          <w:i/>
-          <w:iCs/>
-          <w:color w:val="4A5568"/>
-          <w:sz w:val="20"/>
-        </w:rPr>
-        <w:t xml:space="preserve"> </w:t>
-      </w:r>
-      <w:proofErr w:type="spellStart"/>
-      <w:r>
-        <w:rPr>
-          <w:rFonts w:ascii="Times New Roman" w:eastAsia="Times New Roman" w:hAnsi="Times New Roman" w:cs="Times New Roman"/>
-          <w:i/>
-          <w:iCs/>
-          <w:color w:val="4A5568"/>
-          <w:sz w:val="20"/>
-        </w:rPr>
-        <w:t>Bizagi</w:t>
-      </w:r>
-      <w:proofErr w:type="spellEnd"/>
-      <w:r>
-        <w:rPr>
-          <w:rFonts w:ascii="Times New Roman" w:eastAsia="Times New Roman" w:hAnsi="Times New Roman" w:cs="Times New Roman"/>
-          <w:i/>
-          <w:iCs/>
-          <w:color w:val="4A5568"/>
-          <w:sz w:val="20"/>
-        </w:rPr>
-        <w:t>.</w:t>
+        <w:t>Figura 4. Diagrama de proceso as-is del mantenimiento de equipos. Fuente: elaboración propia en Bizagi.</w:t>
       </w:r>
     </w:p>
+    <w:p/>
     <w:p>
-      <w:r>
-        <w:t xml:space="preserve">M.02 — </w:t>
-      </w:r>
-      <w:proofErr w:type="spellStart"/>
-      <w:r>
-        <w:t>Gestión</w:t>
-      </w:r>
-      <w:proofErr w:type="spellEnd"/>
-      <w:r>
-        <w:t xml:space="preserve"> de </w:t>
-      </w:r>
-      <w:proofErr w:type="spellStart"/>
-      <w:r>
-        <w:t>Infraestructura</w:t>
-      </w:r>
-      <w:proofErr w:type="spellEnd"/>
-      <w:r>
-        <w:t xml:space="preserve"> </w:t>
-      </w:r>
-      <w:proofErr w:type="spellStart"/>
-      <w:r>
-        <w:t>Tecnológica</w:t>
-      </w:r>
-      <w:proofErr w:type="spellEnd"/>
-    </w:p>
-    <w:p>
-      <w:r>
-        <w:rPr>
-          <w:noProof/>
-          <w:lang w:val="es-ES"/>
-        </w:rPr>
+      <w:pPr>
+        <w:jc w:val="center"/>
+      </w:pPr>
+      <w:r>
         <w:drawing>
-          <wp:inline distT="0" distB="0" distL="0" distR="0" wp14:anchorId="3CE8CED2" wp14:editId="4A532DF9">
-            <wp:extent cx="5400040" cy="1300480"/>
-            <wp:effectExtent l="0" t="0" r="0" b="0"/>
-            <wp:docPr id="15" name="Imagen 15"/>
+          <wp:inline xmlns:a="http://schemas.openxmlformats.org/drawingml/2006/main" xmlns:pic="http://schemas.openxmlformats.org/drawingml/2006/picture">
+            <wp:extent cx="5580000" cy="2602873"/>
+            <wp:docPr id="100023" name="Picture 100023"/>
             <wp:cNvGraphicFramePr>
-              <a:graphicFrameLocks xmlns:a="http://schemas.openxmlformats.org/drawingml/2006/main" noChangeAspect="1"/>
+              <a:graphicFrameLocks noChangeAspect="1"/>
             </wp:cNvGraphicFramePr>
-            <a:graphic xmlns:a="http://schemas.openxmlformats.org/drawingml/2006/main">
+            <a:graphic>
               <a:graphicData uri="http://schemas.openxmlformats.org/drawingml/2006/picture">
-                <pic:pic xmlns:pic="http://schemas.openxmlformats.org/drawingml/2006/picture">
+                <pic:pic>
                   <pic:nvPicPr>
-                    <pic:cNvPr id="1" name=""/>
+                    <pic:cNvPr id="0" name="image.png"/>
                     <pic:cNvPicPr/>
                   </pic:nvPicPr>
                   <pic:blipFill>
-                    <a:blip r:embed="rId13"/>
+                    <a:blip r:embed="rId36"/>
                     <a:stretch>
                       <a:fillRect/>
                     </a:stretch>
@@ -7714,11 +7449,9 @@
                   <pic:spPr>
                     <a:xfrm>
                       <a:off x="0" y="0"/>
-                      <a:ext cx="5400040" cy="1300480"/>
+                      <a:ext cx="5580000" cy="2602873"/>
                     </a:xfrm>
-                    <a:prstGeom prst="rect">
-                      <a:avLst/>
-                    </a:prstGeom>
+                    <a:prstGeom prst="rect"/>
                   </pic:spPr>
                 </pic:pic>
               </a:graphicData>
@@ -7728,209 +7461,42 @@
       </w:r>
     </w:p>
     <w:p>
-      <w:proofErr w:type="spellStart"/>
-      <w:r>
-        <w:rPr>
-          <w:rFonts w:ascii="Times New Roman" w:eastAsia="Times New Roman" w:hAnsi="Times New Roman" w:cs="Times New Roman"/>
+      <w:pPr>
+        <w:jc w:val="center"/>
+      </w:pPr>
+      <w:r>
+        <w:rPr>
+          <w:rFonts w:ascii="Times New Roman" w:hAnsi="Times New Roman" w:eastAsia="Times New Roman"/>
+          <w:b w:val="0"/>
           <w:i/>
-          <w:iCs/>
           <w:color w:val="4A5568"/>
           <w:sz w:val="20"/>
         </w:rPr>
-        <w:t>Figura</w:t>
-      </w:r>
-      <w:proofErr w:type="spellEnd"/>
-      <w:r>
-        <w:rPr>
-          <w:rFonts w:ascii="Times New Roman" w:eastAsia="Times New Roman" w:hAnsi="Times New Roman" w:cs="Times New Roman"/>
-          <w:i/>
-          <w:iCs/>
-          <w:color w:val="4A5568"/>
-          <w:sz w:val="20"/>
-        </w:rPr>
-        <w:t xml:space="preserve"> 5. </w:t>
-      </w:r>
-      <w:proofErr w:type="spellStart"/>
-      <w:r>
-        <w:rPr>
-          <w:rFonts w:ascii="Times New Roman" w:eastAsia="Times New Roman" w:hAnsi="Times New Roman" w:cs="Times New Roman"/>
-          <w:i/>
-          <w:iCs/>
-          <w:color w:val="4A5568"/>
-          <w:sz w:val="20"/>
-        </w:rPr>
-        <w:t>Diagrama</w:t>
-      </w:r>
-      <w:proofErr w:type="spellEnd"/>
-      <w:r>
-        <w:rPr>
-          <w:rFonts w:ascii="Times New Roman" w:eastAsia="Times New Roman" w:hAnsi="Times New Roman" w:cs="Times New Roman"/>
-          <w:i/>
-          <w:iCs/>
-          <w:color w:val="4A5568"/>
-          <w:sz w:val="20"/>
-        </w:rPr>
-        <w:t xml:space="preserve"> de </w:t>
-      </w:r>
-      <w:proofErr w:type="spellStart"/>
-      <w:r>
-        <w:rPr>
-          <w:rFonts w:ascii="Times New Roman" w:eastAsia="Times New Roman" w:hAnsi="Times New Roman" w:cs="Times New Roman"/>
-          <w:i/>
-          <w:iCs/>
-          <w:color w:val="4A5568"/>
-          <w:sz w:val="20"/>
-        </w:rPr>
-        <w:t>proceso</w:t>
-      </w:r>
-      <w:proofErr w:type="spellEnd"/>
-      <w:r>
-        <w:rPr>
-          <w:rFonts w:ascii="Times New Roman" w:eastAsia="Times New Roman" w:hAnsi="Times New Roman" w:cs="Times New Roman"/>
-          <w:i/>
-          <w:iCs/>
-          <w:color w:val="4A5568"/>
-          <w:sz w:val="20"/>
-        </w:rPr>
-        <w:t xml:space="preserve"> as-is. Fuente: </w:t>
-      </w:r>
-      <w:proofErr w:type="spellStart"/>
-      <w:r>
-        <w:rPr>
-          <w:rFonts w:ascii="Times New Roman" w:eastAsia="Times New Roman" w:hAnsi="Times New Roman" w:cs="Times New Roman"/>
-          <w:i/>
-          <w:iCs/>
-          <w:color w:val="4A5568"/>
-          <w:sz w:val="20"/>
-        </w:rPr>
-        <w:t>elaboración</w:t>
-      </w:r>
-      <w:proofErr w:type="spellEnd"/>
-      <w:r>
-        <w:rPr>
-          <w:rFonts w:ascii="Times New Roman" w:eastAsia="Times New Roman" w:hAnsi="Times New Roman" w:cs="Times New Roman"/>
-          <w:i/>
-          <w:iCs/>
-          <w:color w:val="4A5568"/>
-          <w:sz w:val="20"/>
-        </w:rPr>
-        <w:t xml:space="preserve"> </w:t>
-      </w:r>
-      <w:proofErr w:type="spellStart"/>
-      <w:r>
-        <w:rPr>
-          <w:rFonts w:ascii="Times New Roman" w:eastAsia="Times New Roman" w:hAnsi="Times New Roman" w:cs="Times New Roman"/>
-          <w:i/>
-          <w:iCs/>
-          <w:color w:val="4A5568"/>
-          <w:sz w:val="20"/>
-        </w:rPr>
-        <w:t>propia</w:t>
-      </w:r>
-      <w:proofErr w:type="spellEnd"/>
-      <w:r>
-        <w:rPr>
-          <w:rFonts w:ascii="Times New Roman" w:eastAsia="Times New Roman" w:hAnsi="Times New Roman" w:cs="Times New Roman"/>
-          <w:i/>
-          <w:iCs/>
-          <w:color w:val="4A5568"/>
-          <w:sz w:val="20"/>
-        </w:rPr>
-        <w:t xml:space="preserve"> </w:t>
-      </w:r>
-      <w:proofErr w:type="spellStart"/>
-      <w:r>
-        <w:rPr>
-          <w:rFonts w:ascii="Times New Roman" w:eastAsia="Times New Roman" w:hAnsi="Times New Roman" w:cs="Times New Roman"/>
-          <w:i/>
-          <w:iCs/>
-          <w:color w:val="4A5568"/>
-          <w:sz w:val="20"/>
-        </w:rPr>
-        <w:t>en</w:t>
-      </w:r>
-      <w:proofErr w:type="spellEnd"/>
-      <w:r>
-        <w:rPr>
-          <w:rFonts w:ascii="Times New Roman" w:eastAsia="Times New Roman" w:hAnsi="Times New Roman" w:cs="Times New Roman"/>
-          <w:i/>
-          <w:iCs/>
-          <w:color w:val="4A5568"/>
-          <w:sz w:val="20"/>
-        </w:rPr>
-        <w:t xml:space="preserve"> </w:t>
-      </w:r>
-      <w:proofErr w:type="spellStart"/>
-      <w:r>
-        <w:rPr>
-          <w:rFonts w:ascii="Times New Roman" w:eastAsia="Times New Roman" w:hAnsi="Times New Roman" w:cs="Times New Roman"/>
-          <w:i/>
-          <w:iCs/>
-          <w:color w:val="4A5568"/>
-          <w:sz w:val="20"/>
-        </w:rPr>
-        <w:t>Bizagi</w:t>
-      </w:r>
-      <w:proofErr w:type="spellEnd"/>
-      <w:r>
-        <w:rPr>
-          <w:rFonts w:ascii="Times New Roman" w:eastAsia="Times New Roman" w:hAnsi="Times New Roman" w:cs="Times New Roman"/>
-          <w:i/>
-          <w:iCs/>
-          <w:color w:val="4A5568"/>
-          <w:sz w:val="20"/>
-        </w:rPr>
-        <w:t>.</w:t>
+        <w:t>Figura 5. Diagrama de proceso to-be del mantenimiento de equipos. Fuente: elaboración propia en Bizagi.</w:t>
       </w:r>
     </w:p>
+    <w:p/>
     <w:p>
-      <w:r>
-        <w:t xml:space="preserve">M.03 — </w:t>
-      </w:r>
-      <w:proofErr w:type="spellStart"/>
-      <w:r>
-        <w:t>Gestión</w:t>
-      </w:r>
-      <w:proofErr w:type="spellEnd"/>
-      <w:r>
-        <w:t xml:space="preserve"> de </w:t>
-      </w:r>
-      <w:proofErr w:type="spellStart"/>
-      <w:r>
-        <w:t>Activos</w:t>
-      </w:r>
-      <w:proofErr w:type="spellEnd"/>
-      <w:r>
-        <w:t xml:space="preserve"> </w:t>
-      </w:r>
-      <w:proofErr w:type="spellStart"/>
-      <w:r>
-        <w:t>Informáticos</w:t>
-      </w:r>
-      <w:proofErr w:type="spellEnd"/>
-    </w:p>
-    <w:p>
-      <w:r>
-        <w:rPr>
-          <w:noProof/>
-        </w:rPr>
+      <w:pPr>
+        <w:jc w:val="center"/>
+      </w:pPr>
+      <w:r>
         <w:drawing>
-          <wp:inline distT="0" distB="0" distL="0" distR="0" wp14:anchorId="3876F4B2" wp14:editId="469617FF">
-            <wp:extent cx="5400040" cy="2237105"/>
-            <wp:effectExtent l="0" t="0" r="0" b="0"/>
-            <wp:docPr id="1" name="Imagen 1"/>
+          <wp:inline xmlns:a="http://schemas.openxmlformats.org/drawingml/2006/main" xmlns:pic="http://schemas.openxmlformats.org/drawingml/2006/picture">
+            <wp:extent cx="5580000" cy="4938537"/>
+            <wp:docPr id="100024" name="Picture 100024"/>
             <wp:cNvGraphicFramePr>
-              <a:graphicFrameLocks xmlns:a="http://schemas.openxmlformats.org/drawingml/2006/main" noChangeAspect="1"/>
+              <a:graphicFrameLocks noChangeAspect="1"/>
             </wp:cNvGraphicFramePr>
-            <a:graphic xmlns:a="http://schemas.openxmlformats.org/drawingml/2006/main">
+            <a:graphic>
               <a:graphicData uri="http://schemas.openxmlformats.org/drawingml/2006/picture">
-                <pic:pic xmlns:pic="http://schemas.openxmlformats.org/drawingml/2006/picture">
+                <pic:pic>
                   <pic:nvPicPr>
-                    <pic:cNvPr id="1" name=""/>
+                    <pic:cNvPr id="0" name="fig_a7_bizagi_ficha_asis.png"/>
                     <pic:cNvPicPr/>
                   </pic:nvPicPr>
                   <pic:blipFill>
-                    <a:blip r:embed="rId14"/>
+                    <a:blip r:embed="rId43"/>
                     <a:stretch>
                       <a:fillRect/>
                     </a:stretch>
@@ -7938,11 +7504,9 @@
                   <pic:spPr>
                     <a:xfrm>
                       <a:off x="0" y="0"/>
-                      <a:ext cx="5400040" cy="2237105"/>
+                      <a:ext cx="5580000" cy="4938537"/>
                     </a:xfrm>
-                    <a:prstGeom prst="rect">
-                      <a:avLst/>
-                    </a:prstGeom>
+                    <a:prstGeom prst="rect"/>
                   </pic:spPr>
                 </pic:pic>
               </a:graphicData>
@@ -7952,210 +7516,42 @@
       </w:r>
     </w:p>
     <w:p>
-      <w:proofErr w:type="spellStart"/>
-      <w:r>
-        <w:rPr>
-          <w:rFonts w:ascii="Times New Roman" w:eastAsia="Times New Roman" w:hAnsi="Times New Roman" w:cs="Times New Roman"/>
+      <w:pPr>
+        <w:jc w:val="center"/>
+      </w:pPr>
+      <w:r>
+        <w:rPr>
+          <w:rFonts w:ascii="Times New Roman" w:hAnsi="Times New Roman" w:eastAsia="Times New Roman"/>
+          <w:b w:val="0"/>
           <w:i/>
-          <w:iCs/>
           <w:color w:val="4A5568"/>
           <w:sz w:val="20"/>
         </w:rPr>
-        <w:t>Figura</w:t>
-      </w:r>
-      <w:proofErr w:type="spellEnd"/>
-      <w:r>
-        <w:rPr>
-          <w:rFonts w:ascii="Times New Roman" w:eastAsia="Times New Roman" w:hAnsi="Times New Roman" w:cs="Times New Roman"/>
-          <w:i/>
-          <w:iCs/>
-          <w:color w:val="4A5568"/>
-          <w:sz w:val="20"/>
-        </w:rPr>
-        <w:t xml:space="preserve"> 6. </w:t>
-      </w:r>
-      <w:proofErr w:type="spellStart"/>
-      <w:r>
-        <w:rPr>
-          <w:rFonts w:ascii="Times New Roman" w:eastAsia="Times New Roman" w:hAnsi="Times New Roman" w:cs="Times New Roman"/>
-          <w:i/>
-          <w:iCs/>
-          <w:color w:val="4A5568"/>
-          <w:sz w:val="20"/>
-        </w:rPr>
-        <w:t>Diagrama</w:t>
-      </w:r>
-      <w:proofErr w:type="spellEnd"/>
-      <w:r>
-        <w:rPr>
-          <w:rFonts w:ascii="Times New Roman" w:eastAsia="Times New Roman" w:hAnsi="Times New Roman" w:cs="Times New Roman"/>
-          <w:i/>
-          <w:iCs/>
-          <w:color w:val="4A5568"/>
-          <w:sz w:val="20"/>
-        </w:rPr>
-        <w:t xml:space="preserve"> de </w:t>
-      </w:r>
-      <w:proofErr w:type="spellStart"/>
-      <w:r>
-        <w:rPr>
-          <w:rFonts w:ascii="Times New Roman" w:eastAsia="Times New Roman" w:hAnsi="Times New Roman" w:cs="Times New Roman"/>
-          <w:i/>
-          <w:iCs/>
-          <w:color w:val="4A5568"/>
-          <w:sz w:val="20"/>
-        </w:rPr>
-        <w:t>proceso</w:t>
-      </w:r>
-      <w:proofErr w:type="spellEnd"/>
-      <w:r>
-        <w:rPr>
-          <w:rFonts w:ascii="Times New Roman" w:eastAsia="Times New Roman" w:hAnsi="Times New Roman" w:cs="Times New Roman"/>
-          <w:i/>
-          <w:iCs/>
-          <w:color w:val="4A5568"/>
-          <w:sz w:val="20"/>
-        </w:rPr>
-        <w:t xml:space="preserve"> as-is. Fuente: </w:t>
-      </w:r>
-      <w:proofErr w:type="spellStart"/>
-      <w:r>
-        <w:rPr>
-          <w:rFonts w:ascii="Times New Roman" w:eastAsia="Times New Roman" w:hAnsi="Times New Roman" w:cs="Times New Roman"/>
-          <w:i/>
-          <w:iCs/>
-          <w:color w:val="4A5568"/>
-          <w:sz w:val="20"/>
-        </w:rPr>
-        <w:t>elaboración</w:t>
-      </w:r>
-      <w:proofErr w:type="spellEnd"/>
-      <w:r>
-        <w:rPr>
-          <w:rFonts w:ascii="Times New Roman" w:eastAsia="Times New Roman" w:hAnsi="Times New Roman" w:cs="Times New Roman"/>
-          <w:i/>
-          <w:iCs/>
-          <w:color w:val="4A5568"/>
-          <w:sz w:val="20"/>
-        </w:rPr>
-        <w:t xml:space="preserve"> </w:t>
-      </w:r>
-      <w:proofErr w:type="spellStart"/>
-      <w:r>
-        <w:rPr>
-          <w:rFonts w:ascii="Times New Roman" w:eastAsia="Times New Roman" w:hAnsi="Times New Roman" w:cs="Times New Roman"/>
-          <w:i/>
-          <w:iCs/>
-          <w:color w:val="4A5568"/>
-          <w:sz w:val="20"/>
-        </w:rPr>
-        <w:t>propia</w:t>
-      </w:r>
-      <w:proofErr w:type="spellEnd"/>
-      <w:r>
-        <w:rPr>
-          <w:rFonts w:ascii="Times New Roman" w:eastAsia="Times New Roman" w:hAnsi="Times New Roman" w:cs="Times New Roman"/>
-          <w:i/>
-          <w:iCs/>
-          <w:color w:val="4A5568"/>
-          <w:sz w:val="20"/>
-        </w:rPr>
-        <w:t xml:space="preserve"> </w:t>
-      </w:r>
-      <w:proofErr w:type="spellStart"/>
-      <w:r>
-        <w:rPr>
-          <w:rFonts w:ascii="Times New Roman" w:eastAsia="Times New Roman" w:hAnsi="Times New Roman" w:cs="Times New Roman"/>
-          <w:i/>
-          <w:iCs/>
-          <w:color w:val="4A5568"/>
-          <w:sz w:val="20"/>
-        </w:rPr>
-        <w:t>en</w:t>
-      </w:r>
-      <w:proofErr w:type="spellEnd"/>
-      <w:r>
-        <w:rPr>
-          <w:rFonts w:ascii="Times New Roman" w:eastAsia="Times New Roman" w:hAnsi="Times New Roman" w:cs="Times New Roman"/>
-          <w:i/>
-          <w:iCs/>
-          <w:color w:val="4A5568"/>
-          <w:sz w:val="20"/>
-        </w:rPr>
-        <w:t xml:space="preserve"> </w:t>
-      </w:r>
-      <w:proofErr w:type="spellStart"/>
-      <w:r>
-        <w:rPr>
-          <w:rFonts w:ascii="Times New Roman" w:eastAsia="Times New Roman" w:hAnsi="Times New Roman" w:cs="Times New Roman"/>
-          <w:i/>
-          <w:iCs/>
-          <w:color w:val="4A5568"/>
-          <w:sz w:val="20"/>
-        </w:rPr>
-        <w:t>Bizagi</w:t>
-      </w:r>
-      <w:proofErr w:type="spellEnd"/>
-      <w:r>
-        <w:rPr>
-          <w:rFonts w:ascii="Times New Roman" w:eastAsia="Times New Roman" w:hAnsi="Times New Roman" w:cs="Times New Roman"/>
-          <w:i/>
-          <w:iCs/>
-          <w:color w:val="4A5568"/>
-          <w:sz w:val="20"/>
-        </w:rPr>
-        <w:t>.</w:t>
+        <w:t>Figura 6. Diagrama de proceso as-is de la ficha técnica. Fuente: elaboración propia en Bizagi.</w:t>
       </w:r>
     </w:p>
+    <w:p/>
     <w:p>
-      <w:r>
-        <w:lastRenderedPageBreak/>
-        <w:t xml:space="preserve">M.04 — </w:t>
-      </w:r>
-      <w:proofErr w:type="spellStart"/>
-      <w:r>
-        <w:t>Gestión</w:t>
-      </w:r>
-      <w:proofErr w:type="spellEnd"/>
-      <w:r>
-        <w:t xml:space="preserve"> de </w:t>
-      </w:r>
-      <w:proofErr w:type="spellStart"/>
-      <w:r>
-        <w:t>Mantenimiento</w:t>
-      </w:r>
-      <w:proofErr w:type="spellEnd"/>
-      <w:r>
-        <w:t xml:space="preserve"> </w:t>
-      </w:r>
-      <w:proofErr w:type="spellStart"/>
-      <w:r>
-        <w:t>Informático</w:t>
-      </w:r>
-      <w:proofErr w:type="spellEnd"/>
-    </w:p>
-    <w:p>
-      <w:r>
-        <w:rPr>
-          <w:noProof/>
-        </w:rPr>
+      <w:pPr>
+        <w:jc w:val="center"/>
+      </w:pPr>
+      <w:r>
         <w:drawing>
-          <wp:inline distT="0" distB="0" distL="0" distR="0" wp14:anchorId="03C98346" wp14:editId="64BDD252">
-            <wp:extent cx="5400040" cy="1706245"/>
-            <wp:effectExtent l="0" t="0" r="0" b="8255"/>
-            <wp:docPr id="16" name="Imagen 16"/>
+          <wp:inline xmlns:a="http://schemas.openxmlformats.org/drawingml/2006/main" xmlns:pic="http://schemas.openxmlformats.org/drawingml/2006/picture">
+            <wp:extent cx="5580000" cy="2394896"/>
+            <wp:docPr id="100025" name="Picture 100025"/>
             <wp:cNvGraphicFramePr>
-              <a:graphicFrameLocks xmlns:a="http://schemas.openxmlformats.org/drawingml/2006/main" noChangeAspect="1"/>
+              <a:graphicFrameLocks noChangeAspect="1"/>
             </wp:cNvGraphicFramePr>
-            <a:graphic xmlns:a="http://schemas.openxmlformats.org/drawingml/2006/main">
+            <a:graphic>
               <a:graphicData uri="http://schemas.openxmlformats.org/drawingml/2006/picture">
-                <pic:pic xmlns:pic="http://schemas.openxmlformats.org/drawingml/2006/picture">
+                <pic:pic>
                   <pic:nvPicPr>
-                    <pic:cNvPr id="1" name=""/>
+                    <pic:cNvPr id="0" name="fig_a7_bizagi_ficha_tobe.png"/>
                     <pic:cNvPicPr/>
                   </pic:nvPicPr>
                   <pic:blipFill>
-                    <a:blip r:embed="rId15"/>
+                    <a:blip r:embed="rId44"/>
                     <a:stretch>
                       <a:fillRect/>
                     </a:stretch>
@@ -8163,11 +7559,9 @@
                   <pic:spPr>
                     <a:xfrm>
                       <a:off x="0" y="0"/>
-                      <a:ext cx="5400040" cy="1706245"/>
+                      <a:ext cx="5580000" cy="2394896"/>
                     </a:xfrm>
-                    <a:prstGeom prst="rect">
-                      <a:avLst/>
-                    </a:prstGeom>
+                    <a:prstGeom prst="rect"/>
                   </pic:spPr>
                 </pic:pic>
               </a:graphicData>
@@ -8177,509 +7571,21 @@
       </w:r>
     </w:p>
     <w:p>
-      <w:proofErr w:type="spellStart"/>
-      <w:r>
-        <w:rPr>
-          <w:rFonts w:ascii="Times New Roman" w:eastAsia="Times New Roman" w:hAnsi="Times New Roman" w:cs="Times New Roman"/>
+      <w:pPr>
+        <w:jc w:val="center"/>
+      </w:pPr>
+      <w:r>
+        <w:rPr>
+          <w:rFonts w:ascii="Times New Roman" w:hAnsi="Times New Roman" w:eastAsia="Times New Roman"/>
+          <w:b w:val="0"/>
           <w:i/>
-          <w:iCs/>
           <w:color w:val="4A5568"/>
           <w:sz w:val="20"/>
         </w:rPr>
-        <w:t>Figura</w:t>
-      </w:r>
-      <w:proofErr w:type="spellEnd"/>
-      <w:r>
-        <w:rPr>
-          <w:rFonts w:ascii="Times New Roman" w:eastAsia="Times New Roman" w:hAnsi="Times New Roman" w:cs="Times New Roman"/>
-          <w:i/>
-          <w:iCs/>
-          <w:color w:val="4A5568"/>
-          <w:sz w:val="20"/>
-        </w:rPr>
-        <w:t xml:space="preserve"> 7. </w:t>
-      </w:r>
-      <w:proofErr w:type="spellStart"/>
-      <w:r>
-        <w:rPr>
-          <w:rFonts w:ascii="Times New Roman" w:eastAsia="Times New Roman" w:hAnsi="Times New Roman" w:cs="Times New Roman"/>
-          <w:i/>
-          <w:iCs/>
-          <w:color w:val="4A5568"/>
-          <w:sz w:val="20"/>
-        </w:rPr>
-        <w:t>Diagrama</w:t>
-      </w:r>
-      <w:proofErr w:type="spellEnd"/>
-      <w:r>
-        <w:rPr>
-          <w:rFonts w:ascii="Times New Roman" w:eastAsia="Times New Roman" w:hAnsi="Times New Roman" w:cs="Times New Roman"/>
-          <w:i/>
-          <w:iCs/>
-          <w:color w:val="4A5568"/>
-          <w:sz w:val="20"/>
-        </w:rPr>
-        <w:t xml:space="preserve"> de </w:t>
-      </w:r>
-      <w:proofErr w:type="spellStart"/>
-      <w:r>
-        <w:rPr>
-          <w:rFonts w:ascii="Times New Roman" w:eastAsia="Times New Roman" w:hAnsi="Times New Roman" w:cs="Times New Roman"/>
-          <w:i/>
-          <w:iCs/>
-          <w:color w:val="4A5568"/>
-          <w:sz w:val="20"/>
-        </w:rPr>
-        <w:t>proceso</w:t>
-      </w:r>
-      <w:proofErr w:type="spellEnd"/>
-      <w:r>
-        <w:rPr>
-          <w:rFonts w:ascii="Times New Roman" w:eastAsia="Times New Roman" w:hAnsi="Times New Roman" w:cs="Times New Roman"/>
-          <w:i/>
-          <w:iCs/>
-          <w:color w:val="4A5568"/>
-          <w:sz w:val="20"/>
-        </w:rPr>
-        <w:t xml:space="preserve"> as-is. Fuente: </w:t>
-      </w:r>
-      <w:proofErr w:type="spellStart"/>
-      <w:r>
-        <w:rPr>
-          <w:rFonts w:ascii="Times New Roman" w:eastAsia="Times New Roman" w:hAnsi="Times New Roman" w:cs="Times New Roman"/>
-          <w:i/>
-          <w:iCs/>
-          <w:color w:val="4A5568"/>
-          <w:sz w:val="20"/>
-        </w:rPr>
-        <w:t>elaboración</w:t>
-      </w:r>
-      <w:proofErr w:type="spellEnd"/>
-      <w:r>
-        <w:rPr>
-          <w:rFonts w:ascii="Times New Roman" w:eastAsia="Times New Roman" w:hAnsi="Times New Roman" w:cs="Times New Roman"/>
-          <w:i/>
-          <w:iCs/>
-          <w:color w:val="4A5568"/>
-          <w:sz w:val="20"/>
-        </w:rPr>
-        <w:t xml:space="preserve"> </w:t>
-      </w:r>
-      <w:proofErr w:type="spellStart"/>
-      <w:r>
-        <w:rPr>
-          <w:rFonts w:ascii="Times New Roman" w:eastAsia="Times New Roman" w:hAnsi="Times New Roman" w:cs="Times New Roman"/>
-          <w:i/>
-          <w:iCs/>
-          <w:color w:val="4A5568"/>
-          <w:sz w:val="20"/>
-        </w:rPr>
-        <w:t>propia</w:t>
-      </w:r>
-      <w:proofErr w:type="spellEnd"/>
-      <w:r>
-        <w:rPr>
-          <w:rFonts w:ascii="Times New Roman" w:eastAsia="Times New Roman" w:hAnsi="Times New Roman" w:cs="Times New Roman"/>
-          <w:i/>
-          <w:iCs/>
-          <w:color w:val="4A5568"/>
-          <w:sz w:val="20"/>
-        </w:rPr>
-        <w:t xml:space="preserve"> </w:t>
-      </w:r>
-      <w:proofErr w:type="spellStart"/>
-      <w:r>
-        <w:rPr>
-          <w:rFonts w:ascii="Times New Roman" w:eastAsia="Times New Roman" w:hAnsi="Times New Roman" w:cs="Times New Roman"/>
-          <w:i/>
-          <w:iCs/>
-          <w:color w:val="4A5568"/>
-          <w:sz w:val="20"/>
-        </w:rPr>
-        <w:t>en</w:t>
-      </w:r>
-      <w:proofErr w:type="spellEnd"/>
-      <w:r>
-        <w:rPr>
-          <w:rFonts w:ascii="Times New Roman" w:eastAsia="Times New Roman" w:hAnsi="Times New Roman" w:cs="Times New Roman"/>
-          <w:i/>
-          <w:iCs/>
-          <w:color w:val="4A5568"/>
-          <w:sz w:val="20"/>
-        </w:rPr>
-        <w:t xml:space="preserve"> </w:t>
-      </w:r>
-      <w:proofErr w:type="spellStart"/>
-      <w:r>
-        <w:rPr>
-          <w:rFonts w:ascii="Times New Roman" w:eastAsia="Times New Roman" w:hAnsi="Times New Roman" w:cs="Times New Roman"/>
-          <w:i/>
-          <w:iCs/>
-          <w:color w:val="4A5568"/>
-          <w:sz w:val="20"/>
-        </w:rPr>
-        <w:t>Bizagi</w:t>
-      </w:r>
-      <w:proofErr w:type="spellEnd"/>
-      <w:r>
-        <w:rPr>
-          <w:rFonts w:ascii="Times New Roman" w:eastAsia="Times New Roman" w:hAnsi="Times New Roman" w:cs="Times New Roman"/>
-          <w:i/>
-          <w:iCs/>
-          <w:color w:val="4A5568"/>
-          <w:sz w:val="20"/>
-        </w:rPr>
-        <w:t>.</w:t>
+        <w:t>Figura 7. Diagrama de proceso to-be de la ficha técnica. Fuente: elaboración propia en Bizagi.</w:t>
       </w:r>
     </w:p>
-    <w:p>
-      <w:r>
-        <w:t xml:space="preserve">M.05 — </w:t>
-      </w:r>
-      <w:proofErr w:type="spellStart"/>
-      <w:r>
-        <w:t>Gestión</w:t>
-      </w:r>
-      <w:proofErr w:type="spellEnd"/>
-      <w:r>
-        <w:t xml:space="preserve"> de </w:t>
-      </w:r>
-      <w:proofErr w:type="spellStart"/>
-      <w:r>
-        <w:t>Soporte</w:t>
-      </w:r>
-      <w:proofErr w:type="spellEnd"/>
-      <w:r>
-        <w:t xml:space="preserve"> Técnico y Mesa de </w:t>
-      </w:r>
-      <w:proofErr w:type="spellStart"/>
-      <w:r>
-        <w:t>Ayuda</w:t>
-      </w:r>
-      <w:proofErr w:type="spellEnd"/>
-    </w:p>
-    <w:p>
-      <w:r>
-        <w:drawing>
-          <wp:inline distT="0" distB="0" distL="0" distR="0" wp14:anchorId="46B3FE9D" wp14:editId="2339F63C">
-            <wp:extent cx="5580380" cy="1917065"/>
-            <wp:effectExtent l="0" t="0" r="1270" b="6985"/>
-            <wp:docPr id="2" name="Imagen 2"/>
-            <wp:cNvGraphicFramePr>
-              <a:graphicFrameLocks xmlns:a="http://schemas.openxmlformats.org/drawingml/2006/main" noChangeAspect="1"/>
-            </wp:cNvGraphicFramePr>
-            <a:graphic xmlns:a="http://schemas.openxmlformats.org/drawingml/2006/main">
-              <a:graphicData uri="http://schemas.openxmlformats.org/drawingml/2006/picture">
-                <pic:pic xmlns:pic="http://schemas.openxmlformats.org/drawingml/2006/picture">
-                  <pic:nvPicPr>
-                    <pic:cNvPr id="1" name=""/>
-                    <pic:cNvPicPr/>
-                  </pic:nvPicPr>
-                  <pic:blipFill>
-                    <a:blip r:embed="rId16"/>
-                    <a:stretch>
-                      <a:fillRect/>
-                    </a:stretch>
-                  </pic:blipFill>
-                  <pic:spPr>
-                    <a:xfrm>
-                      <a:off x="0" y="0"/>
-                      <a:ext cx="5580380" cy="1917065"/>
-                    </a:xfrm>
-                    <a:prstGeom prst="rect">
-                      <a:avLst/>
-                    </a:prstGeom>
-                  </pic:spPr>
-                </pic:pic>
-              </a:graphicData>
-            </a:graphic>
-          </wp:inline>
-        </w:drawing>
-      </w:r>
-      <w:bookmarkStart w:id="0" w:name="_GoBack"/>
-      <w:bookmarkEnd w:id="0"/>
-    </w:p>
-    <w:p>
-      <w:proofErr w:type="spellStart"/>
-      <w:r>
-        <w:rPr>
-          <w:rFonts w:ascii="Times New Roman" w:eastAsia="Times New Roman" w:hAnsi="Times New Roman" w:cs="Times New Roman"/>
-          <w:i/>
-          <w:iCs/>
-          <w:color w:val="4A5568"/>
-          <w:sz w:val="20"/>
-        </w:rPr>
-        <w:t>Figura</w:t>
-      </w:r>
-      <w:proofErr w:type="spellEnd"/>
-      <w:r>
-        <w:rPr>
-          <w:rFonts w:ascii="Times New Roman" w:eastAsia="Times New Roman" w:hAnsi="Times New Roman" w:cs="Times New Roman"/>
-          <w:i/>
-          <w:iCs/>
-          <w:color w:val="4A5568"/>
-          <w:sz w:val="20"/>
-        </w:rPr>
-        <w:t xml:space="preserve"> 8. </w:t>
-      </w:r>
-      <w:proofErr w:type="spellStart"/>
-      <w:r>
-        <w:rPr>
-          <w:rFonts w:ascii="Times New Roman" w:eastAsia="Times New Roman" w:hAnsi="Times New Roman" w:cs="Times New Roman"/>
-          <w:i/>
-          <w:iCs/>
-          <w:color w:val="4A5568"/>
-          <w:sz w:val="20"/>
-        </w:rPr>
-        <w:t>Diagrama</w:t>
-      </w:r>
-      <w:proofErr w:type="spellEnd"/>
-      <w:r>
-        <w:rPr>
-          <w:rFonts w:ascii="Times New Roman" w:eastAsia="Times New Roman" w:hAnsi="Times New Roman" w:cs="Times New Roman"/>
-          <w:i/>
-          <w:iCs/>
-          <w:color w:val="4A5568"/>
-          <w:sz w:val="20"/>
-        </w:rPr>
-        <w:t xml:space="preserve"> de </w:t>
-      </w:r>
-      <w:proofErr w:type="spellStart"/>
-      <w:r>
-        <w:rPr>
-          <w:rFonts w:ascii="Times New Roman" w:eastAsia="Times New Roman" w:hAnsi="Times New Roman" w:cs="Times New Roman"/>
-          <w:i/>
-          <w:iCs/>
-          <w:color w:val="4A5568"/>
-          <w:sz w:val="20"/>
-        </w:rPr>
-        <w:t>proceso</w:t>
-      </w:r>
-      <w:proofErr w:type="spellEnd"/>
-      <w:r>
-        <w:rPr>
-          <w:rFonts w:ascii="Times New Roman" w:eastAsia="Times New Roman" w:hAnsi="Times New Roman" w:cs="Times New Roman"/>
-          <w:i/>
-          <w:iCs/>
-          <w:color w:val="4A5568"/>
-          <w:sz w:val="20"/>
-        </w:rPr>
-        <w:t xml:space="preserve"> as-is. Fuente: </w:t>
-      </w:r>
-      <w:proofErr w:type="spellStart"/>
-      <w:r>
-        <w:rPr>
-          <w:rFonts w:ascii="Times New Roman" w:eastAsia="Times New Roman" w:hAnsi="Times New Roman" w:cs="Times New Roman"/>
-          <w:i/>
-          <w:iCs/>
-          <w:color w:val="4A5568"/>
-          <w:sz w:val="20"/>
-        </w:rPr>
-        <w:t>elaboración</w:t>
-      </w:r>
-      <w:proofErr w:type="spellEnd"/>
-      <w:r>
-        <w:rPr>
-          <w:rFonts w:ascii="Times New Roman" w:eastAsia="Times New Roman" w:hAnsi="Times New Roman" w:cs="Times New Roman"/>
-          <w:i/>
-          <w:iCs/>
-          <w:color w:val="4A5568"/>
-          <w:sz w:val="20"/>
-        </w:rPr>
-        <w:t xml:space="preserve"> </w:t>
-      </w:r>
-      <w:proofErr w:type="spellStart"/>
-      <w:r>
-        <w:rPr>
-          <w:rFonts w:ascii="Times New Roman" w:eastAsia="Times New Roman" w:hAnsi="Times New Roman" w:cs="Times New Roman"/>
-          <w:i/>
-          <w:iCs/>
-          <w:color w:val="4A5568"/>
-          <w:sz w:val="20"/>
-        </w:rPr>
-        <w:t>propia</w:t>
-      </w:r>
-      <w:proofErr w:type="spellEnd"/>
-      <w:r>
-        <w:rPr>
-          <w:rFonts w:ascii="Times New Roman" w:eastAsia="Times New Roman" w:hAnsi="Times New Roman" w:cs="Times New Roman"/>
-          <w:i/>
-          <w:iCs/>
-          <w:color w:val="4A5568"/>
-          <w:sz w:val="20"/>
-        </w:rPr>
-        <w:t xml:space="preserve"> </w:t>
-      </w:r>
-      <w:proofErr w:type="spellStart"/>
-      <w:r>
-        <w:rPr>
-          <w:rFonts w:ascii="Times New Roman" w:eastAsia="Times New Roman" w:hAnsi="Times New Roman" w:cs="Times New Roman"/>
-          <w:i/>
-          <w:iCs/>
-          <w:color w:val="4A5568"/>
-          <w:sz w:val="20"/>
-        </w:rPr>
-        <w:t>en</w:t>
-      </w:r>
-      <w:proofErr w:type="spellEnd"/>
-      <w:r>
-        <w:rPr>
-          <w:rFonts w:ascii="Times New Roman" w:eastAsia="Times New Roman" w:hAnsi="Times New Roman" w:cs="Times New Roman"/>
-          <w:i/>
-          <w:iCs/>
-          <w:color w:val="4A5568"/>
-          <w:sz w:val="20"/>
-        </w:rPr>
-        <w:t xml:space="preserve"> </w:t>
-      </w:r>
-      <w:proofErr w:type="spellStart"/>
-      <w:r>
-        <w:rPr>
-          <w:rFonts w:ascii="Times New Roman" w:eastAsia="Times New Roman" w:hAnsi="Times New Roman" w:cs="Times New Roman"/>
-          <w:i/>
-          <w:iCs/>
-          <w:color w:val="4A5568"/>
-          <w:sz w:val="20"/>
-        </w:rPr>
-        <w:t>Bizagi</w:t>
-      </w:r>
-      <w:proofErr w:type="spellEnd"/>
-      <w:r>
-        <w:rPr>
-          <w:rFonts w:ascii="Times New Roman" w:eastAsia="Times New Roman" w:hAnsi="Times New Roman" w:cs="Times New Roman"/>
-          <w:i/>
-          <w:iCs/>
-          <w:color w:val="4A5568"/>
-          <w:sz w:val="20"/>
-        </w:rPr>
-        <w:t>.</w:t>
-      </w:r>
-    </w:p>
-    <w:p>
-      <w:pPr>
-        <w:spacing w:before="120" w:after="40" w:line="240" w:lineRule="auto"/>
-        <w:jc w:val="center"/>
-      </w:pPr>
-      <w:r>
-        <w:rPr>
-          <w:noProof/>
-        </w:rPr>
-        <w:drawing>
-          <wp:inline distT="0" distB="0" distL="0" distR="0" wp14:anchorId="68E03A52" wp14:editId="7D2A42BD">
-            <wp:extent cx="5581650" cy="2257425"/>
-            <wp:effectExtent l="0" t="0" r="0" b="0"/>
-            <wp:docPr id="100003" name="Picture 100003"/>
-            <wp:cNvGraphicFramePr>
-              <a:graphicFrameLocks xmlns:a="http://schemas.openxmlformats.org/drawingml/2006/main" noChangeAspect="1"/>
-            </wp:cNvGraphicFramePr>
-            <a:graphic xmlns:a="http://schemas.openxmlformats.org/drawingml/2006/main">
-              <a:graphicData uri="http://schemas.openxmlformats.org/drawingml/2006/picture">
-                <pic:pic xmlns:pic="http://schemas.openxmlformats.org/drawingml/2006/picture">
-                  <pic:nvPicPr>
-                    <pic:cNvPr id="100003" name="image100003"/>
-                    <pic:cNvPicPr/>
-                  </pic:nvPicPr>
-                  <pic:blipFill>
-                    <a:blip r:embed="rId17"/>
-                    <a:stretch>
-                      <a:fillRect/>
-                    </a:stretch>
-                  </pic:blipFill>
-                  <pic:spPr>
-                    <a:xfrm>
-                      <a:off x="0" y="0"/>
-                      <a:ext cx="5581650" cy="2257425"/>
-                    </a:xfrm>
-                    <a:prstGeom prst="rect">
-                      <a:avLst/>
-                    </a:prstGeom>
-                  </pic:spPr>
-                </pic:pic>
-              </a:graphicData>
-            </a:graphic>
-          </wp:inline>
-        </w:drawing>
-      </w:r>
-    </w:p>
-    <w:p>
-      <w:pPr>
-        <w:spacing w:before="80" w:after="240" w:line="240" w:lineRule="auto"/>
-        <w:jc w:val="center"/>
-      </w:pPr>
-      <w:r>
-        <w:rPr>
-          <w:rFonts w:ascii="Times New Roman" w:eastAsia="Times New Roman" w:hAnsi="Times New Roman" w:cs="Times New Roman"/>
-          <w:i/>
-          <w:iCs/>
-          <w:color w:val="4A5568"/>
-          <w:sz w:val="20"/>
-        </w:rPr>
-        <w:t>Figura 4. Diagrama de proceso as-is. Fuente: elaboración propia en Bizagi. [PEGAR EXPORT]</w:t>
-      </w:r>
-    </w:p>
-    <w:p>
-      <w:pPr>
-        <w:spacing w:before="120" w:after="40" w:line="240" w:lineRule="auto"/>
-        <w:jc w:val="center"/>
-      </w:pPr>
-      <w:r>
-        <w:rPr>
-          <w:noProof/>
-        </w:rPr>
-        <w:lastRenderedPageBreak/>
-        <w:drawing>
-          <wp:inline distT="0" distB="0" distL="0" distR="0" wp14:anchorId="594F3C87" wp14:editId="4FD1E839">
-            <wp:extent cx="5581650" cy="2257425"/>
-            <wp:effectExtent l="0" t="0" r="0" b="0"/>
-            <wp:docPr id="100004" name="Picture 100004"/>
-            <wp:cNvGraphicFramePr>
-              <a:graphicFrameLocks xmlns:a="http://schemas.openxmlformats.org/drawingml/2006/main" noChangeAspect="1"/>
-            </wp:cNvGraphicFramePr>
-            <a:graphic xmlns:a="http://schemas.openxmlformats.org/drawingml/2006/main">
-              <a:graphicData uri="http://schemas.openxmlformats.org/drawingml/2006/picture">
-                <pic:pic xmlns:pic="http://schemas.openxmlformats.org/drawingml/2006/picture">
-                  <pic:nvPicPr>
-                    <pic:cNvPr id="100004" name="image100004"/>
-                    <pic:cNvPicPr/>
-                  </pic:nvPicPr>
-                  <pic:blipFill>
-                    <a:blip r:embed="rId18"/>
-                    <a:stretch>
-                      <a:fillRect/>
-                    </a:stretch>
-                  </pic:blipFill>
-                  <pic:spPr>
-                    <a:xfrm>
-                      <a:off x="0" y="0"/>
-                      <a:ext cx="5581650" cy="2257425"/>
-                    </a:xfrm>
-                    <a:prstGeom prst="rect">
-                      <a:avLst/>
-                    </a:prstGeom>
-                  </pic:spPr>
-                </pic:pic>
-              </a:graphicData>
-            </a:graphic>
-          </wp:inline>
-        </w:drawing>
-      </w:r>
-    </w:p>
-    <w:p>
-      <w:pPr>
-        <w:spacing w:before="80" w:after="240" w:line="240" w:lineRule="auto"/>
-        <w:jc w:val="center"/>
-      </w:pPr>
-      <w:r>
-        <w:rPr>
-          <w:rFonts w:ascii="Times New Roman" w:eastAsia="Times New Roman" w:hAnsi="Times New Roman" w:cs="Times New Roman"/>
-          <w:i/>
-          <w:iCs/>
-          <w:color w:val="4A5568"/>
-          <w:sz w:val="20"/>
-        </w:rPr>
-        <w:t>Figura 5. Diagrama de proceso to-be. Fuente: elaboración propia en Bizagi. [PEGAR EXPORT]</w:t>
-      </w:r>
-    </w:p>
+    <w:p/>
     <w:p>
       <w:pPr>
         <w:pBdr>
@@ -9110,7 +8016,7 @@
                 <w:color w:val="1A1A1A"/>
                 <w:sz w:val="16"/>
               </w:rPr>
-              <w:t>Catálogo; Figura 9; repositorio GitHub</w:t>
+              <w:t>Catálogo; Figura 8; repositorio GitHub</w:t>
             </w:r>
           </w:p>
         </w:tc>
@@ -9563,7 +8469,7 @@
           <w:color w:val="1A1A1A"/>
           <w:sz w:val="24"/>
         </w:rPr>
-        <w:t>Los prompts se organizaron por fase en un repositorio versionado, según la Figura 9. La carpeta 01_requisitos contiene R-001 a R-005; 02_diseno, D-001 a D-006; 03_implementacion, I-001 a I-009 (más dos macros Superados); 04_testing, T-001 a T-005; 05_mantenimiento, M-001 a M-004; y gobernanza reúne la plantilla maestra, el catálogo, la política de uso de IA y el registro de métricas. La convención de confirmación cita el código del prompt del incremento (por ejemplo, feat(inventario): descripción [I-002]). No se versiona el historial de conversación con el agente: el registro es la instrucción reejecutable.</w:t>
+        <w:t>Los prompts se organizaron por fase en un repositorio versionado, según la Figura 8. La carpeta 01_requisitos contiene R-001 a R-006; 02_diseno, D-001 a D-007; 03_implementacion, I-001 a I-017 (más dos macros Superados); 04_testing, T-001 a T-014; 05_mantenimiento, M-001 a M-004; iso, P-ISO-001 a P-ISO-003; y gobernanza reúne la plantilla maestra, el catálogo, la política de uso de IA y el registro de métricas. La convención de confirmación cita el código del prompt del incremento (por ejemplo, feat(inventario): descripción [I-002]). No se versiona el historial de conversación con el agente: el registro es la instrucción reejecutable.</w:t>
       </w:r>
     </w:p>
     <w:p>
@@ -9661,7 +8567,7 @@
           <w:color w:val="4A5568"/>
           <w:sz w:val="20"/>
         </w:rPr>
-        <w:t>Figura 9. Árbol del repositorio de prompts del caso Sigemad MPA.</w:t>
+        <w:t>Figura 8. Árbol del repositorio de prompts del caso Sigemad MPA.</w:t>
       </w:r>
     </w:p>
     <w:p>
@@ -11811,7 +10717,7 @@
           <w:color w:val="1A1A1A"/>
           <w:sz w:val="24"/>
         </w:rPr>
-        <w:t>La Figura 10 resume ese ciclo. La letra identifica la fase: R es requisitos, D es diseño, I es implementación, T es pruebas (del inglés testing) y M es mantenimiento. El número que sigue a la letra identifica el prompt vigente de esa fase, no un capítulo de la tesis ni un sprint. Así, R-004 es el registro de ambigüedades de requisitos y I-007 es el prompt con el que se construyó el microservicio de aprendizaje automático. Al cerrar mantenimiento puede abrirse un nuevo ciclo de requisitos si hay un cambio de alcance.</w:t>
+        <w:t>La Figura 9 resume ese ciclo. La letra identifica la fase: R es requisitos, D es diseño, I es implementación, T es pruebas (del inglés testing) y M es mantenimiento. El número que sigue a la letra identifica el prompt vigente de esa fase, no un capítulo de la tesis ni un sprint. Así, R-004 es el registro de ambigüedades de requisitos y I-007 es el prompt con el que se construyó el microservicio de aprendizaje automático. Al cerrar mantenimiento puede abrirse un nuevo ciclo de requisitos si hay un cambio de alcance.</w:t>
       </w:r>
     </w:p>
     <w:p/>
@@ -11874,7 +10780,7 @@
           <w:iCs/>
           <w:color w:val="1A1A1A"/>
         </w:rPr>
-        <w:t>Figura 10. Ciclo de vida R–D–I–T–M: Requisitos, Diseño, Implementación, Pruebas y Mantenimiento, con la familia de prompts vigentes.</w:t>
+        <w:t>Figura 9. Ciclo de vida R–D–I–T–M: Requisitos, Diseño, Implementación, Pruebas y Mantenimiento, con la familia de prompts vigentes.</w:t>
       </w:r>
     </w:p>
     <w:p>
@@ -11889,7 +10795,7 @@
           <w:color w:val="1A1A1A"/>
           <w:sz w:val="24"/>
         </w:rPr>
-        <w:t>La Figura 10 se lee de izquierda a derecha. Cada recuadro muestra la letra de la fase, su nombre completo y el rango de prompts vigentes (R-001 a R-005, D-001 a D-006, I-001 a I-009, T-001 a T-005 y M-001 a M-004). Esos rangos son la familia D3 del caso, no una lista de tareas abiertas. El detalle de técnica, artefacto y decisión D2 se desarrolla en las Tablas 9 a 13.</w:t>
+        <w:t>La Figura 9 se lee de izquierda a derecha. Cada recuadro muestra la letra de la fase, su nombre completo y el rango de prompts vigentes (R-001 a R-005, D-001 a D-006, I-001 a I-009, T-001 a T-005 y M-001 a M-004). Esos rangos son la familia D3 del caso, no una lista de tareas abiertas. El detalle de técnica, artefacto y decisión D2 se desarrolla en las Tablas 9 a 13. Esa figura corresponde al corte de las primeras oleadas. El catálogo vigente reúne 48 prompts: R-001 a R-006, D-001 a D-007, I-001 a I-017, T-001 a T-014 y M-001 a M-004. Tres permanecen como plantilla (T-005, el M-002 de análisis de impacto y M-003). Los dos macros Superados y los tres prompts de mapas de proceso quedan fuera de esos 48.</w:t>
       </w:r>
     </w:p>
     <w:p>
@@ -11950,7 +10856,7 @@
           <w:iCs/>
           <w:color w:val="1A1A1A"/>
         </w:rPr>
-        <w:t>Figura 11. Línea de incrementos de producto (versiones 0.1.0 a 0.9.1) y prompt de implementación asociado. No son sprints Scrum.</w:t>
+        <w:t>Figura 10. Línea de incrementos de producto (versiones 0.1.0 a 0.9.1) y prompt de implementación asociado. No son sprints Scrum.</w:t>
       </w:r>
     </w:p>
     <w:p>
@@ -11965,7 +10871,7 @@
           <w:color w:val="1A1A1A"/>
           <w:sz w:val="24"/>
         </w:rPr>
-        <w:t xml:space="preserve">La Figura 11 no sustituye a la Figura 10: recorta solo la fase de implementación y muestra cómo el producto creció por incrementos. No es un calendario de sprints ni una caja de dos semanas. Cada recuadro tiene tres datos: la versión del software (0.1.0 a 0.9.1), </w:t>
+        <w:t>La Figura 10 no sustituye a la Figura 9: recorta solo la fase de implementación y muestra cómo el producto creció por incrementos. No es un calendario de sprints ni una caja de dos semanas. Cada recuadro tiene tres datos: la versión del software (0.1.0 a 0.9.1), el prompt de implementación que la produjo (I-001 a I-009) y el módulo entregado. I-001 no significa «incremento uno» de forma aislada: la I identifica la fase de implementación y el número es el identificador del prompt.</w:t>
       </w:r>
       <w:r>
         <w:rPr>
@@ -11973,8 +10879,6 @@
           <w:color w:val="1A1A1A"/>
           <w:sz w:val="24"/>
         </w:rPr>
-        <w:lastRenderedPageBreak/>
-        <w:t>el prompt de implementación que la produjo (I-001 a I-009) y el módulo entregado. I-001 no significa «incremento uno» de forma aislada: la I identifica la fase de implementación y el número es el identificador del prompt.</w:t>
       </w:r>
     </w:p>
     <w:p>
@@ -11989,7 +10893,7 @@
           <w:color w:val="1A1A1A"/>
           <w:sz w:val="24"/>
         </w:rPr>
-        <w:t>La lectura de la Figura 11 es acumulativa. I-001 (versión 0.1.0) dejó los cimientos, la API y el esquema. I-002 (0.2.0) entregó el inventario de equipos. I-003 (0.3.0) las fichas técnicas y el mantenimiento. I-004 (0.4.0) los reportes PDF. I-005 (0.5.0) la configuración organizacional. I-006 (0.6.0) la autenticación JWT y el tablero. I-007 (0.7.0) el microservicio de aprendizaje automático. I-008 (0.8.0 a 0.9.0) la telemetría y la ficha predictiva. I-009 (parche 0.9.1) el control de acceso por rol y la plantilla Excel. El puente con GitHub (SHA y archivo ancla) está en las Tablas 11 y 14.</w:t>
+        <w:t>La lectura de la Figura 10 es acumulativa. I-001 (versión 0.1.0) dejó los cimientos, la API y el esquema. I-002 (0.2.0) entregó el inventario de equipos. I-003 (0.3.0) las fichas técnicas y el mantenimiento. I-004 (0.4.0) los reportes PDF. I-005 (0.5.0) la configuración organizacional. I-006 (0.6.0) la autenticación JWT y el tablero. I-007 (0.7.0) el microservicio de aprendizaje automático. I-008 (0.8.0 a 0.9.0) la telemetría y la ficha predictiva. I-009 (parche 0.9.1) el control de acceso por rol y la plantilla Excel. El puente con GitHub (SHA y archivo ancla) está en las Tablas 11 y 14.</w:t>
       </w:r>
     </w:p>
     <w:p>
@@ -12034,7 +10938,7 @@
           <w:color w:val="1A1A1A"/>
           <w:sz w:val="24"/>
         </w:rPr>
-        <w:t>Se ejecutaron cinco prompts vigentes. R-001 produjo la ficha del proyecto. R-002 produjo 56 historias agrupadas en ocho épicas, usadas como técnica de requisitos y no como ítems de sprint. R-003 describió las personas de Administrador, Técnico y Practicante. R-004 registró ambigüedades con estado honesto (cerrado o supuesto) y se ejecutó en la oleada 3. R-005 redactó requisitos no funcionales verificables, con identificador y evidencia. Los cinco registros recibieron decisión D2 Aprobado, con mezcla de estados Reconstruido y Ejecutado, según la Tabla 9. Los entregables quedan en documents/01_requisitos/.</w:t>
+        <w:t>Se ejecutaron cinco prompts vigentes. R-001 produjo la ficha del proyecto. R-002 produjo 56 historias agrupadas en ocho épicas, usadas como técnica de requisitos y no como ítems de sprint. R-003 describió las personas de Administrador, Técnico y Practicante. R-004 registró ambigüedades con estado honesto (cerrado o supuesto) y se ejecutó en la oleada 3. R-005 redactó requisitos no funcionales verificables, con identificador y evidencia. Los cinco registros recibieron decisión D2 Aprobado, con mezcla de estados Reconstruido y Ejecutado, según la Tabla 9. Los entregables quedan en documents/01_requisitos/. Con posterioridad, R-006 cerró el cronograma anual del incremento 8 (versión 0.10.7), junto con D-007. La serie de implementación llega a I-017 y la de pruebas a T-014.</w:t>
       </w:r>
     </w:p>
     <w:p/>
@@ -14748,7 +13652,7 @@
           <w:color w:val="1A1A1A"/>
           <w:sz w:val="24"/>
         </w:rPr>
-        <w:t>Tres registros ilustran el patrón. I-002 construyó el CRUD de equipos y el código patrimonial de doce dígitos. I-007 levantó el microservicio de aprendizaje automático con degradación si el servicio no está disponible. I-009 incorporó requireRole tras un hallazgo de seguridad: la autorización no podía quedar solo en la interfaz. I-008 e I-009 no borran el commit de origen de los módulos que evolucionan. Las Tablas 11 y 14 concentran incrementos, versiones y anclas en el repositorio; la Figura 11 es la vista de esa línea de producto.</w:t>
+        <w:t>Tres registros ilustran el patrón. I-002 construyó el CRUD de equipos y el código patrimonial de doce dígitos. I-007 levantó el microservicio de aprendizaje automático con degradación si el servicio no está disponible. I-009 incorporó requireRole tras un hallazgo de seguridad: la autorización no podía quedar solo en la interfaz. I-008 e I-009 no borran el commit de origen de los módulos que evolucionan. Las Tablas 11 y 14 concentran incrementos, versiones y anclas en el repositorio; la Figura 10 es la vista de esa línea de producto.</w:t>
       </w:r>
     </w:p>
     <w:p/>
@@ -19788,7 +18692,7 @@
           <w:color w:val="1A1A1A"/>
           <w:sz w:val="24"/>
         </w:rPr>
-        <w:t>D2 es el ciclo con el que se evalúa cada salida del agente antes de darla por cerrada. No basta con que el modelo haya generado texto o código: un humano mide, diagnostica, refina si hace falta y deja una decisión escrita. Ese ciclo vive en el bloque «Evaluación D2» de cada registro de prompt y se consolida en prompts/gobernanza/registro_metricas.md. La Figura 12 muestra los cuatro pasos y el significado de cada decisión en este caso.</w:t>
+        <w:t>D2 es el ciclo con el que se evalúa cada salida del agente antes de darla por cerrada. No basta con que el modelo haya generado texto o código: un humano mide, diagnostica, refina si hace falta y deja una decisión escrita. Ese ciclo vive en el bloque «Evaluación D2» de cada registro de prompt y se consolida en prompts/gobernanza/registro_metricas.md. La Figura 11 muestra los cuatro pasos y el significado de cada decisión en este caso.</w:t>
       </w:r>
     </w:p>
     <w:p>
@@ -19881,7 +18785,7 @@
           <w:iCs/>
           <w:color w:val="1A1A1A"/>
         </w:rPr>
-        <w:t>Figura 12. Ciclo D2 aplicado: medición, diagnóstico, refinamiento y decisión, con el significado de cada cierre en Sigemad.</w:t>
+        <w:t>Figura 11. Ciclo D2 aplicado: medición, diagnóstico, refinamiento y decisión, con el significado de cada cierre en Sigemad.</w:t>
       </w:r>
     </w:p>
     <w:p>
@@ -19896,7 +18800,7 @@
           <w:color w:val="1A1A1A"/>
           <w:sz w:val="24"/>
         </w:rPr>
-        <w:t>La Figura 12 se lee de izquierda a derecha. El responsable no le pide al modelo que «se autoevalúe»: mide con pruebas y revisión, diagnostica el desvío, cambia el prompt o lo parte, y escribe la decisión. Aprobado cierra el registro. Refinado o Dividir vuelve a la medición. Rechazado impide integrar. Superado conserva el archivo histórico, pero deja de citarse en commits nuevos.</w:t>
+        <w:t>La Figura 11 se lee de izquierda a derecha. El responsable no le pide al modelo que «se autoevalúe»: mide con pruebas y revisión, diagnostica el desvío, cambia el prompt o lo parte, y escribe la decisión. Aprobado cierra el registro. Refinado o Dividir vuelve a la medición. Rechazado impide integrar. Superado conserva el archivo histórico, pero deja de citarse en commits nuevos.</w:t>
       </w:r>
     </w:p>
     <w:p>
@@ -21809,7 +20713,7 @@
           <w:color w:val="1A1A1A"/>
           <w:sz w:val="24"/>
         </w:rPr>
-        <w:t>La Figura 13 explica la lectura con un ejemplo real del caso. Para el inventario (F-003) la pregunta «qué se le pidió a la IA» se responde con I-002; «dónde quedó el código» con el commit f086a63; «qué archivo abro» con EquipoController.php en ese SHA. El mismo esquema se aplica a las demás funciones. Los SHA no se repiten en este apartado: constan en la Tabla 14 y el Excel completo es el Apéndice A.</w:t>
+        <w:t>La Figura 12 explica la lectura con un ejemplo real del caso. Para el inventario (F-003) la pregunta «qué se le pidió a la IA» se responde con I-002; «dónde quedó el código» con el commit f086a63; «qué archivo abro» con EquipoController.php en ese SHA. El mismo esquema se aplica a las demás funciones. Los SHA no se repiten en este apartado: constan en la Tabla 14 y el Excel completo es el Apéndice A.</w:t>
       </w:r>
     </w:p>
     <w:p/>
@@ -21871,7 +20775,7 @@
           <w:iCs/>
           <w:color w:val="1A1A1A"/>
         </w:rPr>
-        <w:t>Figura 13. Lectura de la matriz de doble entrada: función, prompt, commit y archivo (ejemplo F-003 inventario).</w:t>
+        <w:t>Figura 12. Lectura de la matriz de doble entrada: función, prompt, commit y archivo (ejemplo F-003 inventario).</w:t>
       </w:r>
     </w:p>
     <w:p>
@@ -21886,7 +20790,7 @@
           <w:color w:val="1A1A1A"/>
           <w:sz w:val="24"/>
         </w:rPr>
-        <w:t>La Figura 13 se lee como cuatro preguntas en cadena, no como un diagrama técnico. Función, prompt, commit y archivo deben coincidir. Un mismo commit puede anclar dos funciones (por ejemplo F-003 y F-008 en f086a63), pero cada una conserva su prompt. I-008 e I-009 son evoluciones posteriores: no borran el SHA de origen.</w:t>
+        <w:t>La Figura 12 se lee como cuatro preguntas en cadena, no como un diagrama técnico. Función, prompt, commit y archivo deben coincidir. Un mismo commit puede anclar dos funciones (por ejemplo F-003 y F-008 en f086a63), pero cada una conserva su prompt. I-008 e I-009 son evoluciones posteriores: no borran el SHA de origen.</w:t>
       </w:r>
     </w:p>
     <w:p>
@@ -22713,7 +21617,7 @@
           <w:color w:val="1A1A1A"/>
           <w:sz w:val="24"/>
         </w:rPr>
-        <w:t>Se alcanzó el nivel N2, ilustrado en la Figura 14: un agente acotado genera artefactos y el responsable humano define el prompt, revisa, prueba e integra. No hubo encadenamiento autónomo de agentes en producción.</w:t>
+        <w:t>Se alcanzó el nivel N2, ilustrado en la Figura 13: un agente acotado genera artefactos y el responsable humano define el prompt, revisa, prueba e integra. No hubo encadenamiento autónomo de agentes en producción.</w:t>
       </w:r>
     </w:p>
     <w:p/>
@@ -22776,7 +21680,7 @@
           <w:color w:val="4A5568"/>
           <w:sz w:val="20"/>
         </w:rPr>
-        <w:t>Figura 14. Escala N1–N5. En este caso se alcanzó el nivel N2 (asistido / agentico acotado).</w:t>
+        <w:t>Figura 13. Escala N1–N5. En este caso se alcanzó el nivel N2 (asistido / agentico acotado).</w:t>
       </w:r>
     </w:p>
     <w:p>
@@ -25006,7 +23910,7 @@
           <w:color w:val="1A1A1A"/>
           <w:sz w:val="24"/>
         </w:rPr>
-        <w:t>En este apartado solo se reportan métricas de proceso (Tabla 20 y Figura 15). La exactitud del modelo asociado a I-007 es una medición D2 de ese registro, no la contrastación de la hipótesis de la tesis.</w:t>
+        <w:t>En este apartado solo se reportan métricas de proceso (Tabla 20 y Figura 14). La exactitud del modelo asociado a I-007 es una medición D2 de ese registro, no la contrastación de la hipótesis de la tesis.</w:t>
       </w:r>
     </w:p>
     <w:p/>
@@ -25495,7 +24399,7 @@
                 <w:color w:val="1A1A1A"/>
                 <w:sz w:val="16"/>
               </w:rPr>
-              <w:t>29 (R×5, D×6, I×9, T×5, M×4)</w:t>
+              <w:t>48 (R×6, D×7, I×17, T×14, M×4)</w:t>
             </w:r>
           </w:p>
         </w:tc>
@@ -25755,7 +24659,7 @@
                 <w:color w:val="1A1A1A"/>
                 <w:sz w:val="16"/>
               </w:rPr>
-              <w:t>29/29</w:t>
+              <w:t>Núcleo 29/29; catálogo 48</w:t>
             </w:r>
           </w:p>
         </w:tc>
@@ -26288,7 +25192,7 @@
           <w:color w:val="4A5568"/>
           <w:sz w:val="20"/>
         </w:rPr>
-        <w:t>Figura 15. Prompts vigentes por fase (no incluye los dos prompts Superados).</w:t>
+        <w:t>Figura 14. Prompts vigentes por fase (no incluye los dos prompts Superados).</w:t>
       </w:r>
     </w:p>
     <w:p>
@@ -27731,7 +26635,7 @@
                 <w:color w:val="1A1A1A"/>
                 <w:sz w:val="16"/>
               </w:rPr>
-              <w:t>Catálogo de prompts versionados (índice, no los 29 textos)</w:t>
+              <w:t>Catálogo de prompts versionados (índice, no los 48 textos)</w:t>
             </w:r>
           </w:p>
         </w:tc>
@@ -28254,10 +27158,12 @@
             <w:r>
               <w:rPr>
                 <w:rFonts w:ascii="Times New Roman" w:eastAsia="Times New Roman" w:hAnsi="Times New Roman" w:cs="Times New Roman"/>
-                <w:color w:val="1A1A1A"/>
-                <w:sz w:val="16"/>
-              </w:rPr>
-              <w:t>Pendiente (pasada 3.4 / 3.5)</w:t>
+                <w:b w:val="0"/>
+                <w:i w:val="0"/>
+                <w:color w:val="1A1A1A"/>
+                <w:sz w:val="20"/>
+              </w:rPr>
+              <w:t>En el apartado 3.5, figuras 4 a 7</w:t>
             </w:r>
           </w:p>
         </w:tc>

</xml_diff>